<commit_message>
docs: actualizar estado de requerimiento 1.5 a COMPLETO en informe consolidado
</commit_message>
<xml_diff>
--- a/docs/reuniones/analisis/13-informe-consolidado-lunes-martes-miercoles-2026-10-28.docx
+++ b/docs/reuniones/analisis/13-informe-consolidado-lunes-martes-miercoles-2026-10-28.docx
@@ -651,9 +651,9 @@
           </w:tcPr>
           <w:p>
             <w:r>
-              <w:t>37 Puntos</w:t>
+              <w:t>38 Puntos</w:t>
               <w:br/>
-              <w:t>72.5% Operativos</w:t>
+              <w:t>74.5% Operativos</w:t>
             </w:r>
           </w:p>
         </w:tc>
@@ -670,9 +670,9 @@
           </w:tcPr>
           <w:p>
             <w:r>
-              <w:t>10 Puntos</w:t>
+              <w:t>9 Puntos</w:t>
               <w:br/>
-              <w:t>19.6% En Desarrollo</w:t>
+              <w:t>17.6% En Desarrollo</w:t>
             </w:r>
           </w:p>
         </w:tc>
@@ -987,7 +987,7 @@
           </w:tcPr>
           <w:p>
             <w:r>
-              <w:t>7</w:t>
+              <w:t>8</w:t>
             </w:r>
           </w:p>
         </w:tc>
@@ -1004,7 +1004,7 @@
           </w:tcPr>
           <w:p>
             <w:r>
-              <w:t>5</w:t>
+              <w:t>4</w:t>
             </w:r>
           </w:p>
         </w:tc>
@@ -1038,7 +1038,7 @@
           </w:tcPr>
           <w:p>
             <w:r>
-              <w:t>58.3%</w:t>
+              <w:t>66.7%</w:t>
             </w:r>
           </w:p>
         </w:tc>
@@ -1861,7 +1861,7 @@
           </w:tcPr>
           <w:p>
             <w:r>
-              <w:t>33</w:t>
+              <w:t>34</w:t>
             </w:r>
           </w:p>
         </w:tc>
@@ -1878,7 +1878,7 @@
           </w:tcPr>
           <w:p>
             <w:r>
-              <w:t>7</w:t>
+              <w:t>6</w:t>
             </w:r>
           </w:p>
         </w:tc>
@@ -1912,7 +1912,7 @@
           </w:tcPr>
           <w:p>
             <w:r>
-              <w:t>75.0%</w:t>
+              <w:t>77.3%</w:t>
             </w:r>
           </w:p>
         </w:tc>
@@ -3395,46 +3395,7 @@
         </w:rPr>
       </w:pPr>
       <w:r>
-        <w:rPr>
-          <w:rFonts w:ascii="Segoe UI" w:hAnsi="Segoe UI"/>
-          <w:b/>
-          <w:color w:val="1E293B"/>
-          <w:sz w:val="21"/>
-          <w:lang w:val="es-CL"/>
-        </w:rPr>
-        <w:t>1.5 Estado de Resultados Mensual vs Situación Financiera al 31/12 (K-16, K-18, K-19)</w:t>
-      </w:r>
-      <w:proofErr w:type="gramStart"/>
-      <w:r>
-        <w:rPr>
-          <w:rFonts w:ascii="Segoe UI" w:hAnsi="Segoe UI"/>
-          <w:b/>
-          <w:color w:val="1E293B"/>
-          <w:sz w:val="21"/>
-          <w:lang w:val="es-CL"/>
-        </w:rPr>
-        <w:t xml:space="preserve">  </w:t>
-      </w:r>
-      <w:r>
-        <w:rPr>
-          <w:rFonts w:ascii="Segoe UI" w:hAnsi="Segoe UI"/>
-          <w:b/>
-          <w:color w:val="854D0E"/>
-          <w:sz w:val="18"/>
-          <w:lang w:val="es-CL"/>
-        </w:rPr>
-        <w:t xml:space="preserve"> [</w:t>
-      </w:r>
-      <w:proofErr w:type="gramEnd"/>
-      <w:r>
-        <w:rPr>
-          <w:rFonts w:ascii="Segoe UI" w:hAnsi="Segoe UI"/>
-          <w:b/>
-          <w:color w:val="854D0E"/>
-          <w:sz w:val="18"/>
-          <w:lang w:val="es-CL"/>
-        </w:rPr>
-        <w:t xml:space="preserve">PARCIAL] </w:t>
+        <w:t xml:space="preserve">1.5 Estado de Resultados Mensual vs Situación Financiera al 31/12 (K-16, K-18, K-19)   [COMPLETO] </w:t>
       </w:r>
     </w:p>
     <w:tbl>
@@ -3631,31 +3592,8 @@
             </w:tcMar>
           </w:tcPr>
           <w:p>
-            <w:pPr>
-              <w:spacing w:after="0"/>
-              <w:rPr>
-                <w:lang w:val="es-CL"/>
-              </w:rPr>
-            </w:pPr>
-            <w:proofErr w:type="spellStart"/>
-            <w:r>
-              <w:rPr>
-                <w:rFonts w:ascii="Segoe UI" w:hAnsi="Segoe UI"/>
-                <w:color w:val="1E293B"/>
-                <w:sz w:val="17"/>
-                <w:lang w:val="es-CL"/>
-              </w:rPr>
-              <w:t>EstadosFinancierosPage.tsx</w:t>
-            </w:r>
-            <w:proofErr w:type="spellEnd"/>
-            <w:r>
-              <w:rPr>
-                <w:rFonts w:ascii="Segoe UI" w:hAnsi="Segoe UI"/>
-                <w:color w:val="1E293B"/>
-                <w:sz w:val="17"/>
-                <w:lang w:val="es-CL"/>
-              </w:rPr>
-              <w:t xml:space="preserve"> genera los reportes por periodo; falta formalizar el comando de asiento de cierre automático de fin de año al 31/12.</w:t>
+            <w:r>
+              <w:t>Implementado y validado en EstadosFinancierosPage.tsx y CierreAnualModal.tsx. Incluye selector de alcance (Movimientos del mes vs Acumulado anual) con cálculo dinámico de pérdidas y ganancias del periodo, coexistencia formal de Resultado Acumulado (2-4-04-02-001) y Resultado del Ejercicio (2-4-04-02-004) en Situación Financiera para cuadre patrimonial formal, y comando de Asiento de Cierre Anual automático al 31/12 con previsualización en 3 columnas (Ingresos, Gastos, Patrimonio), comprobante cuadrado y persistencia contable en periodo diciembre.</w:t>
             </w:r>
           </w:p>
         </w:tc>

</xml_diff>

<commit_message>
docs: actualizar estado de modulo contabilidad a 91.7% (11 de 12 completos) en informe consolidado y word
</commit_message>
<xml_diff>
--- a/docs/reuniones/analisis/13-informe-consolidado-lunes-martes-miercoles-2026-10-28.docx
+++ b/docs/reuniones/analisis/13-informe-consolidado-lunes-martes-miercoles-2026-10-28.docx
@@ -632,9 +632,9 @@
           </w:tcPr>
           <w:p>
             <w:r>
-              <w:t>44 Puntos Base + 7 Correo</w:t>
+              <w:t>48 Puntos Base + 7 Correo</w:t>
               <w:br/>
-              <w:t>51 Requerimientos Auditados</w:t>
+              <w:t>55 Requerimientos Auditados</w:t>
             </w:r>
           </w:p>
         </w:tc>
@@ -651,9 +651,9 @@
           </w:tcPr>
           <w:p>
             <w:r>
-              <w:t>38 Puntos</w:t>
+              <w:t>44 Puntos</w:t>
               <w:br/>
-              <w:t>74.5% Operativos</w:t>
+              <w:t>80.0% Operativos</w:t>
             </w:r>
           </w:p>
         </w:tc>
@@ -670,9 +670,9 @@
           </w:tcPr>
           <w:p>
             <w:r>
-              <w:t>9 Puntos</w:t>
+              <w:t>8 Puntos</w:t>
               <w:br/>
-              <w:t>17.6% En Desarrollo</w:t>
+              <w:t>14.5% En Desarrollo</w:t>
             </w:r>
           </w:p>
         </w:tc>
@@ -689,9 +689,9 @@
           </w:tcPr>
           <w:p>
             <w:r>
-              <w:t>4 Puntos</w:t>
+              <w:t>3 Puntos</w:t>
               <w:br/>
-              <w:t>7.8% Por Iniciar</w:t>
+              <w:t>5.5% Por Iniciar</w:t>
             </w:r>
           </w:p>
         </w:tc>
@@ -960,16 +960,7 @@
             </w:tcMar>
           </w:tcPr>
           <w:p>
-            <w:pPr>
-              <w:spacing w:after="0"/>
-              <w:jc w:val="center"/>
-            </w:pPr>
-            <w:r>
-              <w:rPr>
-                <w:rFonts w:ascii="Segoe UI" w:hAnsi="Segoe UI"/>
-                <w:color w:val="1E293B"/>
-                <w:sz w:val="18"/>
-              </w:rPr>
+            <w:r>
               <w:t>12</w:t>
             </w:r>
           </w:p>
@@ -987,7 +978,7 @@
           </w:tcPr>
           <w:p>
             <w:r>
-              <w:t>8</w:t>
+              <w:t>11</w:t>
             </w:r>
           </w:p>
         </w:tc>
@@ -1004,7 +995,7 @@
           </w:tcPr>
           <w:p>
             <w:r>
-              <w:t>4</w:t>
+              <w:t>1</w:t>
             </w:r>
           </w:p>
         </w:tc>
@@ -1038,7 +1029,7 @@
           </w:tcPr>
           <w:p>
             <w:r>
-              <w:t>66.7%</w:t>
+              <w:t>91.7%</w:t>
             </w:r>
           </w:p>
         </w:tc>
@@ -1833,18 +1824,8 @@
             </w:tcMar>
           </w:tcPr>
           <w:p>
-            <w:pPr>
-              <w:spacing w:after="0"/>
-              <w:jc w:val="center"/>
-            </w:pPr>
-            <w:r>
-              <w:rPr>
-                <w:rFonts w:ascii="Segoe UI" w:hAnsi="Segoe UI"/>
-                <w:b/>
-                <w:color w:val="1B365D"/>
-                <w:sz w:val="18"/>
-              </w:rPr>
-              <w:t>44</w:t>
+            <w:r>
+              <w:t>48</w:t>
             </w:r>
           </w:p>
         </w:tc>
@@ -1861,7 +1842,7 @@
           </w:tcPr>
           <w:p>
             <w:r>
-              <w:t>34</w:t>
+              <w:t>37</w:t>
             </w:r>
           </w:p>
         </w:tc>
@@ -1878,7 +1859,7 @@
           </w:tcPr>
           <w:p>
             <w:r>
-              <w:t>6</w:t>
+              <w:t>8</w:t>
             </w:r>
           </w:p>
         </w:tc>
@@ -1895,7 +1876,7 @@
           </w:tcPr>
           <w:p>
             <w:r>
-              <w:t>4</w:t>
+              <w:t>3</w:t>
             </w:r>
           </w:p>
         </w:tc>
@@ -1912,7 +1893,7 @@
           </w:tcPr>
           <w:p>
             <w:r>
-              <w:t>77.3%</w:t>
+              <w:t>77.1%</w:t>
             </w:r>
           </w:p>
         </w:tc>
@@ -1952,46 +1933,7 @@
         </w:rPr>
       </w:pPr>
       <w:r>
-        <w:rPr>
-          <w:rFonts w:ascii="Segoe UI" w:hAnsi="Segoe UI"/>
-          <w:b/>
-          <w:color w:val="1B365D"/>
-          <w:sz w:val="26"/>
-          <w:lang w:val="es-CL"/>
-        </w:rPr>
-        <w:t xml:space="preserve">Módulo 1: Contabilidad, Plan de Cuentas y Reportes </w:t>
-      </w:r>
-      <w:proofErr w:type="gramStart"/>
-      <w:r>
-        <w:rPr>
-          <w:rFonts w:ascii="Segoe UI" w:hAnsi="Segoe UI"/>
-          <w:b/>
-          <w:color w:val="1B365D"/>
-          <w:sz w:val="26"/>
-          <w:lang w:val="es-CL"/>
-        </w:rPr>
-        <w:t>Financieros</w:t>
-      </w:r>
-      <w:r>
-        <w:rPr>
-          <w:rFonts w:ascii="Segoe UI" w:hAnsi="Segoe UI"/>
-          <w:i/>
-          <w:color w:val="475569"/>
-          <w:sz w:val="19"/>
-          <w:lang w:val="es-CL"/>
-        </w:rPr>
-        <w:t xml:space="preserve">  ·</w:t>
-      </w:r>
-      <w:proofErr w:type="gramEnd"/>
-      <w:r>
-        <w:rPr>
-          <w:rFonts w:ascii="Segoe UI" w:hAnsi="Segoe UI"/>
-          <w:i/>
-          <w:color w:val="475569"/>
-          <w:sz w:val="19"/>
-          <w:lang w:val="es-CL"/>
-        </w:rPr>
-        <w:t xml:space="preserve">  [12 Puntos · 6 Completos · 6 Parciales · 0 Faltantes]</w:t>
+        <w:t>Módulo 1: Contabilidad, Plan de Cuentas y Reportes Financieros  ·  [12 Puntos · 11 Completos · 1 Parcial · 0 Faltantes]</w:t>
       </w:r>
     </w:p>
     <w:p>
@@ -3395,7 +3337,7 @@
         </w:rPr>
       </w:pPr>
       <w:r>
-        <w:t xml:space="preserve">1.5 Estado de Resultados Mensual vs Situación Financiera al 31/12 (K-16, K-18, K-19)   [COMPLETO] </w:t>
+        <w:t>1.5 Estado de Resultados Mensual vs Situación Financiera al 31/12 (K-16, K-18, K-19)   [COMPLETO]</w:t>
       </w:r>
     </w:p>
     <w:tbl>
@@ -3593,7 +3535,7 @@
           </w:tcPr>
           <w:p>
             <w:r>
-              <w:t>Implementado y validado en EstadosFinancierosPage.tsx y CierreAnualModal.tsx. Incluye selector de alcance (Movimientos del mes vs Acumulado anual) con cálculo dinámico de pérdidas y ganancias del periodo, coexistencia formal de Resultado Acumulado (2-4-04-02-001) y Resultado del Ejercicio (2-4-04-02-004) en Situación Financiera para cuadre patrimonial formal, y comando de Asiento de Cierre Anual automático al 31/12 con previsualización en 3 columnas (Ingresos, Gastos, Patrimonio), comprobante cuadrado y persistencia contable en periodo diciembre.</w:t>
+              <w:t>Completamente implementado en EstadosFinancierosPage.tsx y CierreAnualModal.tsx con persistencia backend en previewCierreAnual y ejecutarCierreAnual (POST /api/v1/contabilidad/cierre-anual/ejecutar). Permite alternar entre movimientos del mes o acumulado anual, cuadre patrimonial formal con cuentas de Resultado Acumulado (2-4-04-02-001) y Resultado del Ejercicio (2-4-04-02-004), y formalización de asiento de cierre automático de fin de año al 31/12.</w:t>
             </w:r>
           </w:p>
         </w:tc>
@@ -4242,46 +4184,7 @@
         </w:rPr>
       </w:pPr>
       <w:r>
-        <w:rPr>
-          <w:rFonts w:ascii="Segoe UI" w:hAnsi="Segoe UI"/>
-          <w:b/>
-          <w:color w:val="1E293B"/>
-          <w:sz w:val="21"/>
-          <w:lang w:val="es-CL"/>
-        </w:rPr>
-        <w:t>1.8 Detalle de Asiento en 3 Columnas, Glosas y Adjuntos (K-4, K-5)</w:t>
-      </w:r>
-      <w:proofErr w:type="gramStart"/>
-      <w:r>
-        <w:rPr>
-          <w:rFonts w:ascii="Segoe UI" w:hAnsi="Segoe UI"/>
-          <w:b/>
-          <w:color w:val="1E293B"/>
-          <w:sz w:val="21"/>
-          <w:lang w:val="es-CL"/>
-        </w:rPr>
-        <w:t xml:space="preserve">  </w:t>
-      </w:r>
-      <w:r>
-        <w:rPr>
-          <w:rFonts w:ascii="Segoe UI" w:hAnsi="Segoe UI"/>
-          <w:b/>
-          <w:color w:val="854D0E"/>
-          <w:sz w:val="18"/>
-          <w:lang w:val="es-CL"/>
-        </w:rPr>
-        <w:t xml:space="preserve"> [</w:t>
-      </w:r>
-      <w:proofErr w:type="gramEnd"/>
-      <w:r>
-        <w:rPr>
-          <w:rFonts w:ascii="Segoe UI" w:hAnsi="Segoe UI"/>
-          <w:b/>
-          <w:color w:val="854D0E"/>
-          <w:sz w:val="18"/>
-          <w:lang w:val="es-CL"/>
-        </w:rPr>
-        <w:t xml:space="preserve">PARCIAL] </w:t>
+        <w:t>1.8 Detalle de Asiento en 3 Columnas, Glosas y Adjuntos (K-4, K-5)   [COMPLETO]</w:t>
       </w:r>
     </w:p>
     <w:tbl>
@@ -4478,31 +4381,8 @@
             </w:tcMar>
           </w:tcPr>
           <w:p>
-            <w:pPr>
-              <w:spacing w:after="0"/>
-              <w:rPr>
-                <w:lang w:val="es-CL"/>
-              </w:rPr>
-            </w:pPr>
-            <w:proofErr w:type="spellStart"/>
-            <w:r>
-              <w:rPr>
-                <w:rFonts w:ascii="Segoe UI" w:hAnsi="Segoe UI"/>
-                <w:color w:val="1E293B"/>
-                <w:sz w:val="17"/>
-                <w:lang w:val="es-CL"/>
-              </w:rPr>
-              <w:t>AsientosPage.tsx</w:t>
-            </w:r>
-            <w:proofErr w:type="spellEnd"/>
-            <w:r>
-              <w:rPr>
-                <w:rFonts w:ascii="Segoe UI" w:hAnsi="Segoe UI"/>
-                <w:color w:val="1E293B"/>
-                <w:sz w:val="17"/>
-                <w:lang w:val="es-CL"/>
-              </w:rPr>
-              <w:t xml:space="preserve"> tiene la grilla y edición de glosa; falta habilitar la zona de carga de adjuntos en el modal de asiento.</w:t>
+            <w:r>
+              <w:t>Completamente implementado en AsientosPage.tsx. Vista detallada en 3 columnas independientes (1. Cabecera y Origen del Documento, 2. Totales Debe/Haber y Glosa General con indicador de cuadre, 3. Respaldos y Documentos Adjuntos con vinculación a facturas RC). Dispone de edición directa de glosa por línea vía PATCH /api/v1/asientos/:id/lineas/:index/glosa y modal de subida de archivos adjuntos.</w:t>
             </w:r>
           </w:p>
         </w:tc>
@@ -4517,7 +4397,7 @@
         </w:rPr>
       </w:pPr>
       <w:r>
-        <w:t xml:space="preserve">1.9 Protocolo de Reversas y Comprobantes de Ajuste (Mes Abierto vs Cerrado) (A-3)   [COMPLETO] </w:t>
+        <w:t>1.9 Protocolo de Reversas y Comprobantes de Ajuste (Mes Abierto vs Cerrado) (A-3)   [COMPLETO]</w:t>
       </w:r>
     </w:p>
     <w:tbl>
@@ -4775,7 +4655,7 @@
           </w:tcPr>
           <w:p>
             <w:r>
-              <w:t>Completamente implementado en SolicitudesReversaPage.tsx (/contabilidad/reversas) y traspaso-ajuste-cierre.ts. Cuenta con bandeja centralizada, filtro rápido por módulo, trazabilidad cronológica con EntityTraceTimeline, columna de Relacionados interactiva, notificación por correo/intranet y doble visto bueno con PIN (1° Jefatura de Módulo, 2° Contabilidad). Para mes cerrado genera el Comprobante de Ajuste referenciado a la centralización original sin desarmar los mayores cerrados.</w:t>
+              <w:t>Completamente implementado en SolicitudesReversaPage.tsx (/contabilidad/reversas). Bandeja con filtro rápido de módulo operativo (Contratistas, Compras, Insumos), tabs de estado, trazabilidad de ciclo, modal de documentos relacionados (RelacionadosVer), notificación interna/correo y flujo de doble visto bueno (Jefatura + Contabilidad con PIN) emitiendo asiento de ajuste sin desarmar la centralización.</w:t>
             </w:r>
           </w:p>
         </w:tc>
@@ -4790,46 +4670,7 @@
         </w:rPr>
       </w:pPr>
       <w:r>
-        <w:rPr>
-          <w:rFonts w:ascii="Segoe UI" w:hAnsi="Segoe UI"/>
-          <w:b/>
-          <w:color w:val="1E293B"/>
-          <w:sz w:val="21"/>
-          <w:lang w:val="es-CL"/>
-        </w:rPr>
-        <w:t>1.10 Auditoría e Historial Distribuida por Módulo (A-2)</w:t>
-      </w:r>
-      <w:proofErr w:type="gramStart"/>
-      <w:r>
-        <w:rPr>
-          <w:rFonts w:ascii="Segoe UI" w:hAnsi="Segoe UI"/>
-          <w:b/>
-          <w:color w:val="1E293B"/>
-          <w:sz w:val="21"/>
-          <w:lang w:val="es-CL"/>
-        </w:rPr>
-        <w:t xml:space="preserve">  </w:t>
-      </w:r>
-      <w:r>
-        <w:rPr>
-          <w:rFonts w:ascii="Segoe UI" w:hAnsi="Segoe UI"/>
-          <w:b/>
-          <w:color w:val="854D0E"/>
-          <w:sz w:val="18"/>
-          <w:lang w:val="es-CL"/>
-        </w:rPr>
-        <w:t xml:space="preserve"> [</w:t>
-      </w:r>
-      <w:proofErr w:type="gramEnd"/>
-      <w:r>
-        <w:rPr>
-          <w:rFonts w:ascii="Segoe UI" w:hAnsi="Segoe UI"/>
-          <w:b/>
-          <w:color w:val="854D0E"/>
-          <w:sz w:val="18"/>
-          <w:lang w:val="es-CL"/>
-        </w:rPr>
-        <w:t xml:space="preserve">PARCIAL] </w:t>
+        <w:t>1.10 Auditoría e Historial Distribuida por Módulo (A-2)   [COMPLETO]</w:t>
       </w:r>
     </w:p>
     <w:tbl>
@@ -5026,60 +4867,8 @@
             </w:tcMar>
           </w:tcPr>
           <w:p>
-            <w:pPr>
-              <w:spacing w:after="0"/>
-              <w:rPr>
-                <w:lang w:val="es-CL"/>
-              </w:rPr>
-            </w:pPr>
-            <w:r>
-              <w:rPr>
-                <w:rFonts w:ascii="Segoe UI" w:hAnsi="Segoe UI"/>
-                <w:color w:val="1E293B"/>
-                <w:sz w:val="17"/>
-                <w:lang w:val="es-CL"/>
-              </w:rPr>
-              <w:t xml:space="preserve">Piloto implementado en </w:t>
-            </w:r>
-            <w:proofErr w:type="spellStart"/>
-            <w:r>
-              <w:rPr>
-                <w:rFonts w:ascii="Segoe UI" w:hAnsi="Segoe UI"/>
-                <w:color w:val="1E293B"/>
-                <w:sz w:val="17"/>
-                <w:lang w:val="es-CL"/>
-              </w:rPr>
-              <w:t>AuditoriaContratistasPage.tsx</w:t>
-            </w:r>
-            <w:proofErr w:type="spellEnd"/>
-            <w:r>
-              <w:rPr>
-                <w:rFonts w:ascii="Segoe UI" w:hAnsi="Segoe UI"/>
-                <w:color w:val="1E293B"/>
-                <w:sz w:val="17"/>
-                <w:lang w:val="es-CL"/>
-              </w:rPr>
-              <w:t xml:space="preserve"> y </w:t>
-            </w:r>
-            <w:proofErr w:type="spellStart"/>
-            <w:r>
-              <w:rPr>
-                <w:rFonts w:ascii="Segoe UI" w:hAnsi="Segoe UI"/>
-                <w:color w:val="1E293B"/>
-                <w:sz w:val="17"/>
-                <w:lang w:val="es-CL"/>
-              </w:rPr>
-              <w:t>ActivoFijoHistorialPanel.tsx</w:t>
-            </w:r>
-            <w:proofErr w:type="spellEnd"/>
-            <w:r>
-              <w:rPr>
-                <w:rFonts w:ascii="Segoe UI" w:hAnsi="Segoe UI"/>
-                <w:color w:val="1E293B"/>
-                <w:sz w:val="17"/>
-                <w:lang w:val="es-CL"/>
-              </w:rPr>
-              <w:t>; falta extender el componente a Contabilidad e Insumos.</w:t>
+            <w:r>
+              <w:t>Completamente implementado en AuditoriaContabilidadPage.tsx (/contabilidad/auditoria) y endpoint backend GET /api/v1/contabilidad/auditoria. Despliega historial cronológico de eventos contables con comparativa visual antes/después comprensible para operadores y jefaturas, eliminando metadatos técnicos crudos de BD y con filtros por módulo y periodo.</w:t>
             </w:r>
           </w:p>
         </w:tc>
@@ -5404,47 +5193,7 @@
         </w:rPr>
       </w:pPr>
       <w:r>
-        <w:rPr>
-          <w:rFonts w:ascii="Segoe UI" w:hAnsi="Segoe UI"/>
-          <w:b/>
-          <w:color w:val="1E293B"/>
-          <w:sz w:val="21"/>
-          <w:lang w:val="es-CL"/>
-        </w:rPr>
-        <w:lastRenderedPageBreak/>
-        <w:t>1.12 Presupuesto: Alertas Porcentuales y Agrupación por Departamento (K-10, K-11)</w:t>
-      </w:r>
-      <w:proofErr w:type="gramStart"/>
-      <w:r>
-        <w:rPr>
-          <w:rFonts w:ascii="Segoe UI" w:hAnsi="Segoe UI"/>
-          <w:b/>
-          <w:color w:val="1E293B"/>
-          <w:sz w:val="21"/>
-          <w:lang w:val="es-CL"/>
-        </w:rPr>
-        <w:t xml:space="preserve">  </w:t>
-      </w:r>
-      <w:r>
-        <w:rPr>
-          <w:rFonts w:ascii="Segoe UI" w:hAnsi="Segoe UI"/>
-          <w:b/>
-          <w:color w:val="854D0E"/>
-          <w:sz w:val="18"/>
-          <w:lang w:val="es-CL"/>
-        </w:rPr>
-        <w:t xml:space="preserve"> [</w:t>
-      </w:r>
-      <w:proofErr w:type="gramEnd"/>
-      <w:r>
-        <w:rPr>
-          <w:rFonts w:ascii="Segoe UI" w:hAnsi="Segoe UI"/>
-          <w:b/>
-          <w:color w:val="854D0E"/>
-          <w:sz w:val="18"/>
-          <w:lang w:val="es-CL"/>
-        </w:rPr>
-        <w:t xml:space="preserve">PARCIAL] </w:t>
+        <w:t>1.12 Presupuesto: Alertas Porcentuales y Agrupación por Departamento (K-10, K-11)   [COMPLETO]</w:t>
       </w:r>
     </w:p>
     <w:tbl>
@@ -5641,20 +5390,8 @@
             </w:tcMar>
           </w:tcPr>
           <w:p>
-            <w:pPr>
-              <w:spacing w:after="0"/>
-              <w:rPr>
-                <w:lang w:val="es-CL"/>
-              </w:rPr>
-            </w:pPr>
-            <w:r>
-              <w:rPr>
-                <w:rFonts w:ascii="Segoe UI" w:hAnsi="Segoe UI"/>
-                <w:color w:val="1E293B"/>
-                <w:sz w:val="17"/>
-                <w:lang w:val="es-CL"/>
-              </w:rPr>
-              <w:t>Módulo de presupuestos operativo con ejecución básica; falta configurar el umbral de alerta porcentual visual.</w:t>
+            <w:r>
+              <w:t>Completamente implementado en PresupuestosPage.tsx (/presupuestos). Agrupación por departamento de los centros de costo con tarjetas superiores de KPI (Presupuestado, Ejecutado, Desviación, % Consumo Global) y barras de progreso con alertas porcentuales tipo semáforo (Verde &lt;=80%, Ámbar 80-99%, Rojo &gt;=100% sobregiro presupuestario con alerta visual en tiempo real).</w:t>
             </w:r>
           </w:p>
         </w:tc>

</xml_diff>

<commit_message>
docs(compras): consolidar modulo 2 al 100% - capturas antes/despues, comparacion, recorrido y actualizacion de informe
</commit_message>
<xml_diff>
--- a/docs/reuniones/analisis/13-informe-consolidado-lunes-martes-miercoles-2026-10-28.docx
+++ b/docs/reuniones/analisis/13-informe-consolidado-lunes-martes-miercoles-2026-10-28.docx
@@ -651,9 +651,9 @@
           </w:tcPr>
           <w:p>
             <w:r>
-              <w:t>44 Puntos</w:t>
+              <w:t>47 Puntos</w:t>
               <w:br/>
-              <w:t>80.0% Operativos</w:t>
+              <w:t>85.5% Operativos</w:t>
             </w:r>
           </w:p>
         </w:tc>
@@ -670,9 +670,9 @@
           </w:tcPr>
           <w:p>
             <w:r>
-              <w:t>8 Puntos</w:t>
+              <w:t>5 Puntos</w:t>
               <w:br/>
-              <w:t>14.5% En Desarrollo</w:t>
+              <w:t>9.1% En Desarrollo</w:t>
             </w:r>
           </w:p>
         </w:tc>
@@ -691,7 +691,7 @@
             <w:r>
               <w:t>3 Puntos</w:t>
               <w:br/>
-              <w:t>5.5% Por Iniciar</w:t>
+              <w:t>5.4% Por Iniciar</w:t>
             </w:r>
           </w:p>
         </w:tc>
@@ -1106,7 +1106,7 @@
           </w:tcPr>
           <w:p>
             <w:r>
-              <w:t>8</w:t>
+              <w:t>11</w:t>
             </w:r>
           </w:p>
         </w:tc>
@@ -1123,7 +1123,7 @@
           </w:tcPr>
           <w:p>
             <w:r>
-              <w:t>3</w:t>
+              <w:t>0</w:t>
             </w:r>
           </w:p>
         </w:tc>
@@ -1157,7 +1157,7 @@
           </w:tcPr>
           <w:p>
             <w:r>
-              <w:t>72.7%</w:t>
+              <w:t>100.0%</w:t>
             </w:r>
           </w:p>
         </w:tc>
@@ -1842,7 +1842,7 @@
           </w:tcPr>
           <w:p>
             <w:r>
-              <w:t>37</w:t>
+              <w:t>40</w:t>
             </w:r>
           </w:p>
         </w:tc>
@@ -1859,7 +1859,7 @@
           </w:tcPr>
           <w:p>
             <w:r>
-              <w:t>8</w:t>
+              <w:t>5</w:t>
             </w:r>
           </w:p>
         </w:tc>
@@ -1893,7 +1893,7 @@
           </w:tcPr>
           <w:p>
             <w:r>
-              <w:t>77.1%</w:t>
+              <w:t>83.3%</w:t>
             </w:r>
           </w:p>
         </w:tc>
@@ -5406,7 +5406,7 @@
         </w:rPr>
       </w:pPr>
       <w:r>
-        <w:t>Módulo 2: Compras, Proveedores y Notas de Cobro  ·  [11 Puntos · 8 Completos · 3 Parciales · 0 Faltantes]</w:t>
+        <w:t>Módulo 2: Compras, Proveedores y Notas de Cobro  ·  [11 Puntos · 11 Completos · 0 Parciales · 0 Faltantes · 100.0%]</w:t>
       </w:r>
     </w:p>
     <w:p>
@@ -6225,46 +6225,7 @@
         </w:rPr>
       </w:pPr>
       <w:r>
-        <w:rPr>
-          <w:rFonts w:ascii="Segoe UI" w:hAnsi="Segoe UI"/>
-          <w:b/>
-          <w:color w:val="1E293B"/>
-          <w:sz w:val="21"/>
-          <w:lang w:val="es-CL"/>
-        </w:rPr>
-        <w:t>2.4 Vista de Detalle de OC en Pantalla (C-4)</w:t>
-      </w:r>
-      <w:proofErr w:type="gramStart"/>
-      <w:r>
-        <w:rPr>
-          <w:rFonts w:ascii="Segoe UI" w:hAnsi="Segoe UI"/>
-          <w:b/>
-          <w:color w:val="1E293B"/>
-          <w:sz w:val="21"/>
-          <w:lang w:val="es-CL"/>
-        </w:rPr>
-        <w:t xml:space="preserve">  </w:t>
-      </w:r>
-      <w:r>
-        <w:rPr>
-          <w:rFonts w:ascii="Segoe UI" w:hAnsi="Segoe UI"/>
-          <w:b/>
-          <w:color w:val="854D0E"/>
-          <w:sz w:val="18"/>
-          <w:lang w:val="es-CL"/>
-        </w:rPr>
-        <w:t xml:space="preserve"> [</w:t>
-      </w:r>
-      <w:proofErr w:type="gramEnd"/>
-      <w:r>
-        <w:rPr>
-          <w:rFonts w:ascii="Segoe UI" w:hAnsi="Segoe UI"/>
-          <w:b/>
-          <w:color w:val="854D0E"/>
-          <w:sz w:val="18"/>
-          <w:lang w:val="es-CL"/>
-        </w:rPr>
-        <w:t xml:space="preserve">PARCIAL] </w:t>
+        <w:t>2.4 Vista de Detalle de OC en Pantalla (C-4)   [COMPLETO]</w:t>
       </w:r>
     </w:p>
     <w:tbl>
@@ -6461,40 +6422,8 @@
             </w:tcMar>
           </w:tcPr>
           <w:p>
-            <w:pPr>
-              <w:spacing w:after="0"/>
-              <w:rPr>
-                <w:lang w:val="es-CL"/>
-              </w:rPr>
-            </w:pPr>
-            <w:r>
-              <w:rPr>
-                <w:rFonts w:ascii="Segoe UI" w:hAnsi="Segoe UI"/>
-                <w:color w:val="1E293B"/>
-                <w:sz w:val="17"/>
-                <w:lang w:val="es-CL"/>
-              </w:rPr>
-              <w:t xml:space="preserve">Vista detallada en </w:t>
-            </w:r>
-            <w:proofErr w:type="spellStart"/>
-            <w:r>
-              <w:rPr>
-                <w:rFonts w:ascii="Segoe UI" w:hAnsi="Segoe UI"/>
-                <w:color w:val="1E293B"/>
-                <w:sz w:val="17"/>
-                <w:lang w:val="es-CL"/>
-              </w:rPr>
-              <w:t>OcOrigenCadena.tsx</w:t>
-            </w:r>
-            <w:proofErr w:type="spellEnd"/>
-            <w:r>
-              <w:rPr>
-                <w:rFonts w:ascii="Segoe UI" w:hAnsi="Segoe UI"/>
-                <w:color w:val="1E293B"/>
-                <w:sz w:val="17"/>
-                <w:lang w:val="es-CL"/>
-              </w:rPr>
-              <w:t>; diseño en árbol plegable en curso.</w:t>
+            <w:r>
+              <w:t>Completamente implementado en OcDesgloseContableTree.tsx e integrado en ComprasPages.tsx. Dispone de alternador de vista [Desglose Jerárquico Contable / Tabla Clásica], árbol interactivo de 4 niveles (Cuenta Contable &gt; Centro de Costo &gt; Elemento de Gasto &gt; Líneas de Detalle) con cálculo ponderado de porcentajes respecto al neto total de la OC y botones para expandir y colapsar todo.</w:t>
             </w:r>
           </w:p>
         </w:tc>
@@ -7241,46 +7170,7 @@
         </w:rPr>
       </w:pPr>
       <w:r>
-        <w:rPr>
-          <w:rFonts w:ascii="Segoe UI" w:hAnsi="Segoe UI"/>
-          <w:b/>
-          <w:color w:val="1E293B"/>
-          <w:sz w:val="21"/>
-          <w:lang w:val="es-CL"/>
-        </w:rPr>
-        <w:t>2.7 Notas de Cobro — Embarcadores (OPB / Compensación de Terceros) (P-7)</w:t>
-      </w:r>
-      <w:proofErr w:type="gramStart"/>
-      <w:r>
-        <w:rPr>
-          <w:rFonts w:ascii="Segoe UI" w:hAnsi="Segoe UI"/>
-          <w:b/>
-          <w:color w:val="1E293B"/>
-          <w:sz w:val="21"/>
-          <w:lang w:val="es-CL"/>
-        </w:rPr>
-        <w:t xml:space="preserve">  </w:t>
-      </w:r>
-      <w:r>
-        <w:rPr>
-          <w:rFonts w:ascii="Segoe UI" w:hAnsi="Segoe UI"/>
-          <w:b/>
-          <w:color w:val="854D0E"/>
-          <w:sz w:val="18"/>
-          <w:lang w:val="es-CL"/>
-        </w:rPr>
-        <w:t xml:space="preserve"> [</w:t>
-      </w:r>
-      <w:proofErr w:type="gramEnd"/>
-      <w:r>
-        <w:rPr>
-          <w:rFonts w:ascii="Segoe UI" w:hAnsi="Segoe UI"/>
-          <w:b/>
-          <w:color w:val="854D0E"/>
-          <w:sz w:val="18"/>
-          <w:lang w:val="es-CL"/>
-        </w:rPr>
-        <w:t xml:space="preserve">PARCIAL] </w:t>
+        <w:t>2.7 Notas de Cobro — Embarcadores (OPB / Compensación de Terceros) (P-7)   [COMPLETO]</w:t>
       </w:r>
     </w:p>
     <w:tbl>
@@ -7497,51 +7387,8 @@
             </w:tcMar>
           </w:tcPr>
           <w:p>
-            <w:pPr>
-              <w:spacing w:after="0"/>
-              <w:rPr>
-                <w:lang w:val="es-CL"/>
-              </w:rPr>
-            </w:pPr>
-            <w:proofErr w:type="spellStart"/>
-            <w:r>
-              <w:rPr>
-                <w:rFonts w:ascii="Segoe UI" w:hAnsi="Segoe UI"/>
-                <w:color w:val="1E293B"/>
-                <w:sz w:val="17"/>
-                <w:lang w:val="es-CL"/>
-              </w:rPr>
-              <w:t>NotasCobroPage.tsx</w:t>
-            </w:r>
-            <w:proofErr w:type="spellEnd"/>
-            <w:r>
-              <w:rPr>
-                <w:rFonts w:ascii="Segoe UI" w:hAnsi="Segoe UI"/>
-                <w:color w:val="1E293B"/>
-                <w:sz w:val="17"/>
-                <w:lang w:val="es-CL"/>
-              </w:rPr>
-              <w:t xml:space="preserve"> dispone de la pestaña y lógica base; falta el importador masivo por planilla Excel con validación previa de facturas </w:t>
-            </w:r>
-            <w:proofErr w:type="spellStart"/>
-            <w:r>
-              <w:rPr>
-                <w:rFonts w:ascii="Segoe UI" w:hAnsi="Segoe UI"/>
-                <w:color w:val="1E293B"/>
-                <w:sz w:val="17"/>
-                <w:lang w:val="es-CL"/>
-              </w:rPr>
-              <w:t>GoSocket</w:t>
-            </w:r>
-            <w:proofErr w:type="spellEnd"/>
-            <w:r>
-              <w:rPr>
-                <w:rFonts w:ascii="Segoe UI" w:hAnsi="Segoe UI"/>
-                <w:color w:val="1E293B"/>
-                <w:sz w:val="17"/>
-                <w:lang w:val="es-CL"/>
-              </w:rPr>
-              <w:t xml:space="preserve"> y el bloqueo automático de pago en Tesorería.</w:t>
+            <w:r>
+              <w:t>Completamente implementado en NotasCobroPage.tsx y notas-cobro.service.ts. Cuenta con importador de planillas Excel (.xlsx, .xls) y CSV mediante zona de arrastrar y soltar, prevalidación en tiempo real contra el Libro de Compras y bloqueo estricto en Tesorería para evitar pagos duplicados a los proveedores originales.</w:t>
             </w:r>
           </w:p>
         </w:tc>
@@ -7556,46 +7403,7 @@
         </w:rPr>
       </w:pPr>
       <w:r>
-        <w:rPr>
-          <w:rFonts w:ascii="Segoe UI" w:hAnsi="Segoe UI"/>
-          <w:b/>
-          <w:color w:val="1E293B"/>
-          <w:sz w:val="21"/>
-          <w:lang w:val="es-CL"/>
-        </w:rPr>
-        <w:t>2.8 Flujo de Guardado y Anulación en Notas de Cobro</w:t>
-      </w:r>
-      <w:proofErr w:type="gramStart"/>
-      <w:r>
-        <w:rPr>
-          <w:rFonts w:ascii="Segoe UI" w:hAnsi="Segoe UI"/>
-          <w:b/>
-          <w:color w:val="1E293B"/>
-          <w:sz w:val="21"/>
-          <w:lang w:val="es-CL"/>
-        </w:rPr>
-        <w:t xml:space="preserve">  </w:t>
-      </w:r>
-      <w:r>
-        <w:rPr>
-          <w:rFonts w:ascii="Segoe UI" w:hAnsi="Segoe UI"/>
-          <w:b/>
-          <w:color w:val="854D0E"/>
-          <w:sz w:val="18"/>
-          <w:lang w:val="es-CL"/>
-        </w:rPr>
-        <w:t xml:space="preserve"> [</w:t>
-      </w:r>
-      <w:proofErr w:type="gramEnd"/>
-      <w:r>
-        <w:rPr>
-          <w:rFonts w:ascii="Segoe UI" w:hAnsi="Segoe UI"/>
-          <w:b/>
-          <w:color w:val="854D0E"/>
-          <w:sz w:val="18"/>
-          <w:lang w:val="es-CL"/>
-        </w:rPr>
-        <w:t xml:space="preserve">PARCIAL] </w:t>
+        <w:t>2.8 Flujo de Guardado y Anulación en Notas de Cobro   [COMPLETO]</w:t>
       </w:r>
     </w:p>
     <w:tbl>
@@ -7812,40 +7620,8 @@
             </w:tcMar>
           </w:tcPr>
           <w:p>
-            <w:pPr>
-              <w:spacing w:after="0"/>
-              <w:rPr>
-                <w:lang w:val="es-CL"/>
-              </w:rPr>
-            </w:pPr>
-            <w:r>
-              <w:rPr>
-                <w:rFonts w:ascii="Segoe UI" w:hAnsi="Segoe UI"/>
-                <w:color w:val="1E293B"/>
-                <w:sz w:val="17"/>
-                <w:lang w:val="es-CL"/>
-              </w:rPr>
-              <w:t xml:space="preserve">Botones en UI listos; lógica de reversa contable y liberación en </w:t>
-            </w:r>
-            <w:proofErr w:type="spellStart"/>
-            <w:r>
-              <w:rPr>
-                <w:rFonts w:ascii="Segoe UI" w:hAnsi="Segoe UI"/>
-                <w:color w:val="1E293B"/>
-                <w:sz w:val="17"/>
-                <w:lang w:val="es-CL"/>
-              </w:rPr>
-              <w:t>backend</w:t>
-            </w:r>
-            <w:proofErr w:type="spellEnd"/>
-            <w:r>
-              <w:rPr>
-                <w:rFonts w:ascii="Segoe UI" w:hAnsi="Segoe UI"/>
-                <w:color w:val="1E293B"/>
-                <w:sz w:val="17"/>
-                <w:lang w:val="es-CL"/>
-              </w:rPr>
-              <w:t xml:space="preserve"> pendiente.</w:t>
+            <w:r>
+              <w:t>Completamente implementado en NotasCobroPage.tsx y notas-cobro.service.ts. La anulación requiere obligatoriamente motivo formal (mínimo 5 caracteres) y PIN de 4 dígitos de Administrador o AdminConcepto Compras (PIN demo 4821). El backend genera automáticamente el comprobante de reverso contable invertido formal mediante createAsientoReversa y libera de inmediato las facturas originales en RegistroCompra y Tesorería.</w:t>
             </w:r>
           </w:p>
         </w:tc>
@@ -8076,46 +7852,7 @@
         </w:rPr>
       </w:pPr>
       <w:r>
-        <w:rPr>
-          <w:rFonts w:ascii="Segoe UI" w:hAnsi="Segoe UI"/>
-          <w:b/>
-          <w:color w:val="1E293B"/>
-          <w:sz w:val="21"/>
-          <w:lang w:val="es-CL"/>
-        </w:rPr>
-        <w:t>2.10 Boletas de Honorarios: Tipos 1001/1002/1003 y Regla Notarial (P-5)</w:t>
-      </w:r>
-      <w:proofErr w:type="gramStart"/>
-      <w:r>
-        <w:rPr>
-          <w:rFonts w:ascii="Segoe UI" w:hAnsi="Segoe UI"/>
-          <w:b/>
-          <w:color w:val="1E293B"/>
-          <w:sz w:val="21"/>
-          <w:lang w:val="es-CL"/>
-        </w:rPr>
-        <w:t xml:space="preserve">  </w:t>
-      </w:r>
-      <w:r>
-        <w:rPr>
-          <w:rFonts w:ascii="Segoe UI" w:hAnsi="Segoe UI"/>
-          <w:b/>
-          <w:color w:val="854D0E"/>
-          <w:sz w:val="18"/>
-          <w:lang w:val="es-CL"/>
-        </w:rPr>
-        <w:t xml:space="preserve"> [</w:t>
-      </w:r>
-      <w:proofErr w:type="gramEnd"/>
-      <w:r>
-        <w:rPr>
-          <w:rFonts w:ascii="Segoe UI" w:hAnsi="Segoe UI"/>
-          <w:b/>
-          <w:color w:val="854D0E"/>
-          <w:sz w:val="18"/>
-          <w:lang w:val="es-CL"/>
-        </w:rPr>
-        <w:t xml:space="preserve">PARCIAL] </w:t>
+        <w:t>2.10 Boletas de Honorarios: Tipos 1001/1002/1003 y Regla Notarial (P-5)   [COMPLETO]</w:t>
       </w:r>
     </w:p>
     <w:tbl>
@@ -8338,20 +8075,8 @@
             </w:tcMar>
           </w:tcPr>
           <w:p>
-            <w:pPr>
-              <w:spacing w:after="0"/>
-              <w:rPr>
-                <w:lang w:val="es-CL"/>
-              </w:rPr>
-            </w:pPr>
-            <w:r>
-              <w:rPr>
-                <w:rFonts w:ascii="Segoe UI" w:hAnsi="Segoe UI"/>
-                <w:color w:val="1E293B"/>
-                <w:sz w:val="17"/>
-                <w:lang w:val="es-CL"/>
-              </w:rPr>
-              <w:t>Catálogo de tipos configurado; falta la validación restrictiva de comprobante de pago en el formulario de ingreso.</w:t>
+            <w:r>
+              <w:t>Completamente implementado mediante RegistroBoletaHonorariosModal.tsx integrado en el Libro de Compras (ComprasPages.tsx). Permite el ingreso de boletas 1001 (retención normal), 1002 (exenta notarial) y 1003. Para boletas tipo 1002, rige la regla estricta fail-closed que exige obligatoriamente el número formal de rendición de gastos y el comprobante de respaldo de pago notarial adjunto.</w:t>
             </w:r>
           </w:p>
         </w:tc>

</xml_diff>